<commit_message>
Add assignment 2 updates
</commit_message>
<xml_diff>
--- a/assignments/GGS662_assignment_2.docx
+++ b/assignments/GGS662_assignment_2.docx
@@ -77,21 +77,7 @@
         <w:rPr>
           <w:rFonts w:ascii="Times New Roman" w:hAnsi="Times New Roman" w:cs="Times New Roman"/>
         </w:rPr>
-        <w:t xml:space="preserve">Think back to the fiber route planning task from Week 3. The agent may have produced code, a map, </w:t>
-      </w:r>
-      <w:proofErr w:type="gramStart"/>
-      <w:r>
-        <w:rPr>
-          <w:rFonts w:ascii="Times New Roman" w:hAnsi="Times New Roman" w:cs="Times New Roman"/>
-        </w:rPr>
-        <w:t>a route</w:t>
-      </w:r>
-      <w:proofErr w:type="gramEnd"/>
-      <w:r>
-        <w:rPr>
-          <w:rFonts w:ascii="Times New Roman" w:hAnsi="Times New Roman" w:cs="Times New Roman"/>
-        </w:rPr>
-        <w:t xml:space="preserve"> comparison</w:t>
+        <w:t>Think back to the fiber route planning task from Week 3. The agent may have produced code, a map, a route comparison</w:t>
       </w:r>
       <w:r>
         <w:rPr>
@@ -117,25 +103,133 @@
         <w:rPr>
           <w:rFonts w:ascii="Times New Roman" w:hAnsi="Times New Roman" w:cs="Times New Roman"/>
         </w:rPr>
-        <w:t xml:space="preserve">Create a 5-minute presentation that explains the routing agent approach, presents evidence from your own checks, and identifies which conclusions you </w:t>
-      </w:r>
-      <w:r>
-        <w:rPr>
-          <w:rFonts w:ascii="Times New Roman" w:hAnsi="Times New Roman" w:cs="Times New Roman"/>
-        </w:rPr>
-        <w:t>trust,</w:t>
-      </w:r>
-      <w:r>
-        <w:rPr>
-          <w:rFonts w:ascii="Times New Roman" w:hAnsi="Times New Roman" w:cs="Times New Roman"/>
-        </w:rPr>
-        <w:t xml:space="preserve"> and which remain unresolved. Focus on the existing shortened corridor analysis. You do not need to develop a new agent application</w:t>
-      </w:r>
-      <w:r>
-        <w:rPr>
-          <w:rFonts w:ascii="Times New Roman" w:hAnsi="Times New Roman" w:cs="Times New Roman"/>
-        </w:rPr>
-        <w:t>, but you should show your results, along with other supporting materials developed for verification/validation</w:t>
+        <w:t xml:space="preserve">Create a 5-minute presentation that explains </w:t>
+      </w:r>
+      <w:r>
+        <w:rPr>
+          <w:rFonts w:ascii="Times New Roman" w:hAnsi="Times New Roman" w:cs="Times New Roman"/>
+        </w:rPr>
+        <w:t>your</w:t>
+      </w:r>
+      <w:r>
+        <w:rPr>
+          <w:rFonts w:ascii="Times New Roman" w:hAnsi="Times New Roman" w:cs="Times New Roman"/>
+        </w:rPr>
+        <w:t xml:space="preserve"> </w:t>
+      </w:r>
+      <w:r>
+        <w:rPr>
+          <w:rFonts w:ascii="Times New Roman" w:hAnsi="Times New Roman" w:cs="Times New Roman"/>
+        </w:rPr>
+        <w:t xml:space="preserve">proposed </w:t>
+      </w:r>
+      <w:r>
+        <w:rPr>
+          <w:rFonts w:ascii="Times New Roman" w:hAnsi="Times New Roman" w:cs="Times New Roman"/>
+        </w:rPr>
+        <w:t xml:space="preserve">routing agent approach, present evidence </w:t>
+      </w:r>
+      <w:r>
+        <w:rPr>
+          <w:rFonts w:ascii="Times New Roman" w:hAnsi="Times New Roman" w:cs="Times New Roman"/>
+        </w:rPr>
+        <w:t>from the</w:t>
+      </w:r>
+      <w:r>
+        <w:rPr>
+          <w:rFonts w:ascii="Times New Roman" w:hAnsi="Times New Roman" w:cs="Times New Roman"/>
+        </w:rPr>
+        <w:t xml:space="preserve"> </w:t>
+      </w:r>
+      <w:r>
+        <w:rPr>
+          <w:rFonts w:ascii="Times New Roman" w:hAnsi="Times New Roman" w:cs="Times New Roman"/>
+        </w:rPr>
+        <w:t>checks</w:t>
+      </w:r>
+      <w:r>
+        <w:rPr>
+          <w:rFonts w:ascii="Times New Roman" w:hAnsi="Times New Roman" w:cs="Times New Roman"/>
+        </w:rPr>
+        <w:t xml:space="preserve"> you </w:t>
+      </w:r>
+      <w:r>
+        <w:rPr>
+          <w:rFonts w:ascii="Times New Roman" w:hAnsi="Times New Roman" w:cs="Times New Roman"/>
+        </w:rPr>
+        <w:t>perform</w:t>
+      </w:r>
+      <w:r>
+        <w:rPr>
+          <w:rFonts w:ascii="Times New Roman" w:hAnsi="Times New Roman" w:cs="Times New Roman"/>
+        </w:rPr>
+        <w:t>, and identif</w:t>
+      </w:r>
+      <w:r>
+        <w:rPr>
+          <w:rFonts w:ascii="Times New Roman" w:hAnsi="Times New Roman" w:cs="Times New Roman"/>
+        </w:rPr>
+        <w:t>y</w:t>
+      </w:r>
+      <w:r>
+        <w:rPr>
+          <w:rFonts w:ascii="Times New Roman" w:hAnsi="Times New Roman" w:cs="Times New Roman"/>
+        </w:rPr>
+        <w:t xml:space="preserve"> which conclusions you </w:t>
+      </w:r>
+      <w:r>
+        <w:rPr>
+          <w:rFonts w:ascii="Times New Roman" w:hAnsi="Times New Roman" w:cs="Times New Roman"/>
+        </w:rPr>
+        <w:t>trust</w:t>
+      </w:r>
+      <w:r>
+        <w:rPr>
+          <w:rFonts w:ascii="Times New Roman" w:hAnsi="Times New Roman" w:cs="Times New Roman"/>
+        </w:rPr>
+        <w:t xml:space="preserve"> (and are supported by the evidence)</w:t>
+      </w:r>
+      <w:r>
+        <w:rPr>
+          <w:rFonts w:ascii="Times New Roman" w:hAnsi="Times New Roman" w:cs="Times New Roman"/>
+        </w:rPr>
+        <w:t>,</w:t>
+      </w:r>
+      <w:r>
+        <w:rPr>
+          <w:rFonts w:ascii="Times New Roman" w:hAnsi="Times New Roman" w:cs="Times New Roman"/>
+        </w:rPr>
+        <w:t xml:space="preserve"> </w:t>
+      </w:r>
+      <w:r>
+        <w:rPr>
+          <w:rFonts w:ascii="Times New Roman" w:hAnsi="Times New Roman" w:cs="Times New Roman"/>
+        </w:rPr>
+        <w:t xml:space="preserve">as well as those that may </w:t>
+      </w:r>
+      <w:r>
+        <w:rPr>
+          <w:rFonts w:ascii="Times New Roman" w:hAnsi="Times New Roman" w:cs="Times New Roman"/>
+        </w:rPr>
+        <w:t>remain unresolved. Focus on the existing shortened corridor analysis. You do not need to develop a new agent application</w:t>
+      </w:r>
+      <w:r>
+        <w:rPr>
+          <w:rFonts w:ascii="Times New Roman" w:hAnsi="Times New Roman" w:cs="Times New Roman"/>
+        </w:rPr>
+        <w:t xml:space="preserve">, but you should show </w:t>
+      </w:r>
+      <w:r>
+        <w:rPr>
+          <w:rFonts w:ascii="Times New Roman" w:hAnsi="Times New Roman" w:cs="Times New Roman"/>
+        </w:rPr>
+        <w:t>example</w:t>
+      </w:r>
+      <w:r>
+        <w:rPr>
+          <w:rFonts w:ascii="Times New Roman" w:hAnsi="Times New Roman" w:cs="Times New Roman"/>
+        </w:rPr>
+        <w:t xml:space="preserve"> results, along with other supporting materials developed for verification/validation</w:t>
       </w:r>
       <w:r>
         <w:rPr>
@@ -564,39 +658,7 @@
         <w:rPr>
           <w:rFonts w:ascii="Times New Roman" w:hAnsi="Times New Roman" w:cs="Times New Roman"/>
         </w:rPr>
-        <w:t>Use the saved Week 3 inputs and outputs, the original settings, and AGENTS.md. Preserve the exact endpoints of route1_</w:t>
-      </w:r>
-      <w:proofErr w:type="gramStart"/>
-      <w:r>
-        <w:rPr>
-          <w:rFonts w:ascii="Times New Roman" w:hAnsi="Times New Roman" w:cs="Times New Roman"/>
-        </w:rPr>
-        <w:t>short.gpkg</w:t>
-      </w:r>
-      <w:proofErr w:type="gramEnd"/>
-      <w:r>
-        <w:rPr>
-          <w:rFonts w:ascii="Times New Roman" w:hAnsi="Times New Roman" w:cs="Times New Roman"/>
-        </w:rPr>
-        <w:t>, with the easterly endpoint as the start; measure in EPSG:32737 and retain the original study rectangle. Compare baseline, roads, power, and rail using the same positive cost per mete</w:t>
-      </w:r>
-      <w:r>
-        <w:rPr>
-          <w:rFonts w:ascii="Times New Roman" w:hAnsi="Times New Roman" w:cs="Times New Roman"/>
-        </w:rPr>
-        <w:t>r</w:t>
-      </w:r>
-      <w:r>
-        <w:rPr>
-          <w:rFonts w:ascii="Times New Roman" w:hAnsi="Times New Roman" w:cs="Times New Roman"/>
-        </w:rPr>
-        <w:t>. Preserve source data and the first comparison</w:t>
-      </w:r>
-      <w:r>
-        <w:rPr>
-          <w:rFonts w:ascii="Times New Roman" w:hAnsi="Times New Roman" w:cs="Times New Roman"/>
-        </w:rPr>
-        <w:t xml:space="preserve">. </w:t>
+        <w:t xml:space="preserve">You have freedom to generate results as you wish, but you should be able to show how you introduce tests and/or secondary data sources to verify/validate the tasks you assign to your agentic approach. </w:t>
       </w:r>
     </w:p>
     <w:p>
@@ -610,19 +672,7 @@
         <w:rPr>
           <w:rFonts w:ascii="Times New Roman" w:hAnsi="Times New Roman" w:cs="Times New Roman"/>
         </w:rPr>
-        <w:t xml:space="preserve">Write down at least five expected checks before asking an agent to audit the results. Cover endpoints and continuity, valid geometry and containment, </w:t>
-      </w:r>
-      <w:r>
-        <w:rPr>
-          <w:rFonts w:ascii="Times New Roman" w:hAnsi="Times New Roman" w:cs="Times New Roman"/>
-        </w:rPr>
-        <w:t>meter</w:t>
-      </w:r>
-      <w:r>
-        <w:rPr>
-          <w:rFonts w:ascii="Times New Roman" w:hAnsi="Times New Roman" w:cs="Times New Roman"/>
-        </w:rPr>
-        <w:t>-based length, connector limits and counting, and cost arithmetic. Recompute quantities from the saved evidence rather than accepting the agent's report. Use the 0.01 m tolerances specified in AGENTS.md where applicable. Record the expected result, observed result, method, evidence, and PASS, FAIL, or NOT_CHECKED for each check. Missing evidence is not a pass.</w:t>
+        <w:t>Please submit your presentation online as a PDF by September 27th. You will present it to the class on Monday, September 28th. Include source acknowledgments and a brief AI-use statement. Supporting slides may contain the full check table and details that will not fit within five minutes.</w:t>
       </w:r>
     </w:p>
     <w:p>
@@ -636,21 +686,7 @@
         <w:rPr>
           <w:rFonts w:ascii="Times New Roman" w:hAnsi="Times New Roman" w:cs="Times New Roman"/>
         </w:rPr>
-        <w:t xml:space="preserve">Review the five synthetic routing cases required in AGENTS.md and explain one in your presentation, including its expected outcome. Show that a connector is counted once. If endpoints remain disconnected after permitted repairs, the correct result is </w:t>
-      </w:r>
-      <w:proofErr w:type="spellStart"/>
-      <w:r>
-        <w:rPr>
-          <w:rFonts w:ascii="Times New Roman" w:hAnsi="Times New Roman" w:cs="Times New Roman"/>
-        </w:rPr>
-        <w:t>no_path</w:t>
-      </w:r>
-      <w:proofErr w:type="spellEnd"/>
-      <w:r>
-        <w:rPr>
-          <w:rFonts w:ascii="Times New Roman" w:hAnsi="Times New Roman" w:cs="Times New Roman"/>
-        </w:rPr>
-        <w:t xml:space="preserve"> with blank length and cost; it is not a fabricated straight-line route.</w:t>
+        <w:t xml:space="preserve">Retain your audit script, run command, package versions, check table, and separate sensitivity results under the output folders specified in 04_02, and identify these evidence files in your supporting slides. The submitted presentation should include at least one route map with inferred connectors distinguished and OpenStreetMap attribution, a readable summary of your checks, and the sensitivity comparison. </w:t>
       </w:r>
     </w:p>
     <w:p>
@@ -664,45 +700,7 @@
         <w:rPr>
           <w:rFonts w:ascii="Times New Roman" w:hAnsi="Times New Roman" w:cs="Times New Roman"/>
         </w:rPr>
-        <w:t>Complete the gap</w:t>
-      </w:r>
-      <w:r>
-        <w:rPr>
-          <w:rFonts w:ascii="Times New Roman" w:hAnsi="Times New Roman" w:cs="Times New Roman"/>
-        </w:rPr>
-        <w:t xml:space="preserve"> </w:t>
-      </w:r>
-      <w:r>
-        <w:rPr>
-          <w:rFonts w:ascii="Times New Roman" w:hAnsi="Times New Roman" w:cs="Times New Roman"/>
-        </w:rPr>
-        <w:t>tolerance sensitivity exercise in 04_02</w:t>
-      </w:r>
-      <w:r>
-        <w:rPr>
-          <w:rFonts w:ascii="Times New Roman" w:hAnsi="Times New Roman" w:cs="Times New Roman"/>
-        </w:rPr>
-        <w:t xml:space="preserve">, so </w:t>
-      </w:r>
-      <w:r>
-        <w:rPr>
-          <w:rFonts w:ascii="Times New Roman" w:hAnsi="Times New Roman" w:cs="Times New Roman"/>
-        </w:rPr>
-        <w:t xml:space="preserve">reduce the saved gap tolerance from 50 m to 25 </w:t>
-      </w:r>
-      <w:proofErr w:type="gramStart"/>
-      <w:r>
-        <w:rPr>
-          <w:rFonts w:ascii="Times New Roman" w:hAnsi="Times New Roman" w:cs="Times New Roman"/>
-        </w:rPr>
-        <w:t>m, or</w:t>
-      </w:r>
-      <w:proofErr w:type="gramEnd"/>
-      <w:r>
-        <w:rPr>
-          <w:rFonts w:ascii="Times New Roman" w:hAnsi="Times New Roman" w:cs="Times New Roman"/>
-        </w:rPr>
-        <w:t xml:space="preserve"> use a smaller positive value if your original setting differs. Change only that setting and save the rerun separately. Compare route availability, length, connector use, and the cheapest available candidate. An unchanged result is still useful evidence.</w:t>
+        <w:t>The emphasis is on the quality of your investigation and your explanation of the evidence. Finding and documenting an error or a justified no_path result is valuable. A successful agent run alone does not demonstrate a successful analysis. Table 2 outlines the assessment criteria.</w:t>
       </w:r>
     </w:p>
     <w:p>
@@ -712,27 +710,6 @@
           <w:rFonts w:ascii="Times New Roman" w:hAnsi="Times New Roman" w:cs="Times New Roman"/>
         </w:rPr>
       </w:pPr>
-      <w:r>
-        <w:rPr>
-          <w:rFonts w:ascii="Times New Roman" w:hAnsi="Times New Roman" w:cs="Times New Roman"/>
-        </w:rPr>
-        <w:lastRenderedPageBreak/>
-        <w:t xml:space="preserve">Distinguish computational verification from real-world validation. Identify two possible independent evidence sources and explain their provenance and limitations. Inspect one location using supplied or approved evidence if available; </w:t>
-      </w:r>
-      <w:proofErr w:type="gramStart"/>
-      <w:r>
-        <w:rPr>
-          <w:rFonts w:ascii="Times New Roman" w:hAnsi="Times New Roman" w:cs="Times New Roman"/>
-        </w:rPr>
-        <w:t>otherwise</w:t>
-      </w:r>
-      <w:proofErr w:type="gramEnd"/>
-      <w:r>
-        <w:rPr>
-          <w:rFonts w:ascii="Times New Roman" w:hAnsi="Times New Roman" w:cs="Times New Roman"/>
-        </w:rPr>
-        <w:t xml:space="preserve"> state what remains unresolved. Discuss the simplified assumption that 2D crossings connect and why mapped infrastructure does not establish access rights or construction feasibility.</w:t>
-      </w:r>
     </w:p>
     <w:p>
       <w:pPr>
@@ -741,12 +718,6 @@
           <w:rFonts w:ascii="Times New Roman" w:hAnsi="Times New Roman" w:cs="Times New Roman"/>
         </w:rPr>
       </w:pPr>
-      <w:r>
-        <w:rPr>
-          <w:rFonts w:ascii="Times New Roman" w:hAnsi="Times New Roman" w:cs="Times New Roman"/>
-        </w:rPr>
-        <w:t>Please submit your presentation online as a PDF by September 27th. You will present it to the class on Monday, September 28th. Aim for approximately five main slides: problem and agent framework; route map; verification evidence; sensitivity and validation; conclusions and proposed improvements. Include source acknowledgments and a brief AI-use statement. Supporting slides may contain the full check table and details that will not fit within five minutes.</w:t>
-      </w:r>
     </w:p>
     <w:p>
       <w:pPr>
@@ -755,46 +726,12 @@
           <w:rFonts w:ascii="Times New Roman" w:hAnsi="Times New Roman" w:cs="Times New Roman"/>
         </w:rPr>
       </w:pPr>
-      <w:r>
-        <w:rPr>
-          <w:rFonts w:ascii="Times New Roman" w:hAnsi="Times New Roman" w:cs="Times New Roman"/>
-        </w:rPr>
-        <w:t xml:space="preserve">Retain your audit script, run command, package versions, check table, and separate sensitivity results under the output folders specified in 04_02, and identify these evidence files in your supporting slides. The submitted presentation should include at least one route map with inferred connectors distinguished and OpenStreetMap attribution, a readable summary of your checks, and the sensitivity comparison. </w:t>
-      </w:r>
     </w:p>
     <w:p>
       <w:pPr>
         <w:jc w:val="both"/>
         <w:rPr>
           <w:rFonts w:ascii="Times New Roman" w:hAnsi="Times New Roman" w:cs="Times New Roman"/>
-        </w:rPr>
-      </w:pPr>
-      <w:r>
-        <w:rPr>
-          <w:rFonts w:ascii="Times New Roman" w:hAnsi="Times New Roman" w:cs="Times New Roman"/>
-        </w:rPr>
-        <w:t xml:space="preserve">The emphasis is on the quality of your investigation and your explanation of the evidence. Finding and documenting an error or a justified </w:t>
-      </w:r>
-      <w:proofErr w:type="spellStart"/>
-      <w:r>
-        <w:rPr>
-          <w:rFonts w:ascii="Times New Roman" w:hAnsi="Times New Roman" w:cs="Times New Roman"/>
-        </w:rPr>
-        <w:t>no_path</w:t>
-      </w:r>
-      <w:proofErr w:type="spellEnd"/>
-      <w:r>
-        <w:rPr>
-          <w:rFonts w:ascii="Times New Roman" w:hAnsi="Times New Roman" w:cs="Times New Roman"/>
-        </w:rPr>
-        <w:t xml:space="preserve"> result is valuable. A successful agent run alone does not demonstrate a successful analysis. Table 2 outlines the assessment criteria.</w:t>
-      </w:r>
-    </w:p>
-    <w:p>
-      <w:pPr>
-        <w:jc w:val="both"/>
-        <w:rPr>
-          <w:rFonts w:ascii="Times New Roman" w:hAnsi="Times New Roman" w:cs="Times New Roman"/>
           <w:u w:val="single"/>
         </w:rPr>
       </w:pPr>
@@ -803,6 +740,7 @@
           <w:rFonts w:ascii="Times New Roman" w:hAnsi="Times New Roman" w:cs="Times New Roman"/>
           <w:u w:val="single"/>
         </w:rPr>
+        <w:lastRenderedPageBreak/>
         <w:t>Table 2 Assessment criteria.</w:t>
       </w:r>
     </w:p>
@@ -989,7 +927,43 @@
               <w:rPr>
                 <w:rFonts w:ascii="Times New Roman" w:hAnsi="Times New Roman" w:cs="Times New Roman"/>
               </w:rPr>
-              <w:t>Uses expected and observed results, reproducible checks, and a synthetic case to assess the routing approach.</w:t>
+              <w:t>Use</w:t>
+            </w:r>
+            <w:r>
+              <w:rPr>
+                <w:rFonts w:ascii="Times New Roman" w:hAnsi="Times New Roman" w:cs="Times New Roman"/>
+              </w:rPr>
+              <w:t>s</w:t>
+            </w:r>
+            <w:r>
+              <w:rPr>
+                <w:rFonts w:ascii="Times New Roman" w:hAnsi="Times New Roman" w:cs="Times New Roman"/>
+              </w:rPr>
+              <w:t xml:space="preserve"> expected and observed results, </w:t>
+            </w:r>
+            <w:r>
+              <w:rPr>
+                <w:rFonts w:ascii="Times New Roman" w:hAnsi="Times New Roman" w:cs="Times New Roman"/>
+              </w:rPr>
+              <w:t>external secondary data,</w:t>
+            </w:r>
+            <w:r>
+              <w:rPr>
+                <w:rFonts w:ascii="Times New Roman" w:hAnsi="Times New Roman" w:cs="Times New Roman"/>
+              </w:rPr>
+              <w:t xml:space="preserve"> </w:t>
+            </w:r>
+            <w:r>
+              <w:rPr>
+                <w:rFonts w:ascii="Times New Roman" w:hAnsi="Times New Roman" w:cs="Times New Roman"/>
+              </w:rPr>
+              <w:t xml:space="preserve">reproducible checks, </w:t>
+            </w:r>
+            <w:r>
+              <w:rPr>
+                <w:rFonts w:ascii="Times New Roman" w:hAnsi="Times New Roman" w:cs="Times New Roman"/>
+              </w:rPr>
+              <w:t>and a synthetic case to assess the routing approach.</w:t>
             </w:r>
           </w:p>
         </w:tc>
@@ -1010,7 +984,13 @@
               <w:rPr>
                 <w:rFonts w:ascii="Times New Roman" w:hAnsi="Times New Roman" w:cs="Times New Roman"/>
               </w:rPr>
-              <w:t>35%</w:t>
+              <w:t>40</w:t>
+            </w:r>
+            <w:r>
+              <w:rPr>
+                <w:rFonts w:ascii="Times New Roman" w:hAnsi="Times New Roman" w:cs="Times New Roman"/>
+              </w:rPr>
+              <w:t>%</w:t>
             </w:r>
           </w:p>
         </w:tc>
@@ -1054,7 +1034,19 @@
               <w:rPr>
                 <w:rFonts w:ascii="Times New Roman" w:hAnsi="Times New Roman" w:cs="Times New Roman"/>
               </w:rPr>
-              <w:t>Compares the controlled rerun and assesses independent evidence, spatial assumptions, and unresolved claims.</w:t>
+              <w:t xml:space="preserve">Compares </w:t>
+            </w:r>
+            <w:r>
+              <w:rPr>
+                <w:rFonts w:ascii="Times New Roman" w:hAnsi="Times New Roman" w:cs="Times New Roman"/>
+              </w:rPr>
+              <w:t xml:space="preserve">a </w:t>
+            </w:r>
+            <w:r>
+              <w:rPr>
+                <w:rFonts w:ascii="Times New Roman" w:hAnsi="Times New Roman" w:cs="Times New Roman"/>
+              </w:rPr>
+              <w:t>controlled rerun and assesses independent evidence, spatial assumptions, unresolved claims.</w:t>
             </w:r>
           </w:p>
         </w:tc>
@@ -1075,7 +1067,19 @@
               <w:rPr>
                 <w:rFonts w:ascii="Times New Roman" w:hAnsi="Times New Roman" w:cs="Times New Roman"/>
               </w:rPr>
-              <w:t>25%</w:t>
+              <w:t>2</w:t>
+            </w:r>
+            <w:r>
+              <w:rPr>
+                <w:rFonts w:ascii="Times New Roman" w:hAnsi="Times New Roman" w:cs="Times New Roman"/>
+              </w:rPr>
+              <w:t>0</w:t>
+            </w:r>
+            <w:r>
+              <w:rPr>
+                <w:rFonts w:ascii="Times New Roman" w:hAnsi="Times New Roman" w:cs="Times New Roman"/>
+              </w:rPr>
+              <w:t>%</w:t>
             </w:r>
           </w:p>
         </w:tc>
@@ -1119,7 +1123,31 @@
               <w:rPr>
                 <w:rFonts w:ascii="Times New Roman" w:hAnsi="Times New Roman" w:cs="Times New Roman"/>
               </w:rPr>
-              <w:t>Clear, legible presentation within five minutes, with an informative map, justified conclusions, sources, and AI-use statement.</w:t>
+              <w:t xml:space="preserve">Clear, legible presentation </w:t>
+            </w:r>
+            <w:r>
+              <w:rPr>
+                <w:rFonts w:ascii="Times New Roman" w:hAnsi="Times New Roman" w:cs="Times New Roman"/>
+              </w:rPr>
+              <w:t xml:space="preserve">4-5 </w:t>
+            </w:r>
+            <w:r>
+              <w:rPr>
+                <w:rFonts w:ascii="Times New Roman" w:hAnsi="Times New Roman" w:cs="Times New Roman"/>
+              </w:rPr>
+              <w:t>minutes</w:t>
+            </w:r>
+            <w:r>
+              <w:rPr>
+                <w:rFonts w:ascii="Times New Roman" w:hAnsi="Times New Roman" w:cs="Times New Roman"/>
+              </w:rPr>
+              <w:t xml:space="preserve"> long</w:t>
+            </w:r>
+            <w:r>
+              <w:rPr>
+                <w:rFonts w:ascii="Times New Roman" w:hAnsi="Times New Roman" w:cs="Times New Roman"/>
+              </w:rPr>
+              <w:t>, with an informative map, justified conclusions, sources, and AI-use statement.</w:t>
             </w:r>
           </w:p>
         </w:tc>
@@ -1146,6 +1174,14 @@
         </w:tc>
       </w:tr>
     </w:tbl>
+    <w:p>
+      <w:pPr>
+        <w:jc w:val="both"/>
+        <w:rPr>
+          <w:rFonts w:ascii="Times New Roman" w:hAnsi="Times New Roman" w:cs="Times New Roman"/>
+        </w:rPr>
+      </w:pPr>
+    </w:p>
     <w:p>
       <w:pPr>
         <w:jc w:val="both"/>
@@ -1375,7 +1411,6 @@
       </w:rPr>
       <w:t xml:space="preserve">Agentic </w:t>
     </w:r>
-    <w:proofErr w:type="spellStart"/>
     <w:r>
       <w:rPr>
         <w:rFonts w:ascii="Times New Roman" w:hAnsi="Times New Roman" w:cs="Times New Roman"/>
@@ -1386,7 +1421,6 @@
       </w:rPr>
       <w:t>GeoAI</w:t>
     </w:r>
-    <w:proofErr w:type="spellEnd"/>
     <w:r>
       <w:rPr>
         <w:rFonts w:ascii="Times New Roman" w:hAnsi="Times New Roman" w:cs="Times New Roman"/>

</xml_diff>